<commit_message>
feat(tables): add tables format for cell/row/table formatting
One locator-scoped verb for the local "format this" layer (authoring gaps 3.8 + 3.10): cell shading / vertical + horizontal alignment / borders, row height / repeat-header, and table alignment / style. Cell properties broadcast over every cell the --at locator covers (cell / range / column / row / table); table-level and row-level flags require the matching scope.

Tracking is split by what Word actually round-trips (verified by driving Word via AppleScript accept/reject): cell tcPr props record as <w:tcPrChange>, --halign as <w:pPrChange>, while table/row props Word won't revert ride a [docx-cli] audit comment like the borders verb. read surfaces every property deviation-only via docx:cell / docx:table hints so the changes survive the write-read loop.

Co-Authored-By: Claude Opus 4.8 (1M context) <noreply@anthropic.com>
</commit_message>
<xml_diff>
--- a/tests/fixtures/tables-mutations.docx
+++ b/tests/fixtures/tables-mutations.docx
@@ -10,6 +10,7 @@
     <w:tbl>
       <w:tblPr>
         <w:tblW w:w="5000" w:type="pct"/>
+        <w:jc w:val="center"/>
         <w:tblBorders>
           <w:top w:val="double" w:sz="8" w:space="0" w:color="auto"/>
           <w:left w:val="double" w:sz="8" w:space="0" w:color="auto"/>
@@ -26,12 +27,20 @@
         <w:gridCol w:w="4680"/>
       </w:tblGrid>
       <w:tr>
+        <w:trPr>
+          <w:tblHeader/>
+        </w:trPr>
         <w:tc>
           <w:tcPr>
             <w:tcW w:w="4680" w:type="dxa"/>
             <w:gridSpan w:val="2"/>
-          </w:tcPr>
-          <w:p>
+            <w:shd w:val="clear" w:color="auto" w:fill="D9D9D9"/>
+            <w:vAlign w:val="center"/>
+          </w:tcPr>
+          <w:p>
+            <w:pPr>
+              <w:jc w:val="center"/>
+            </w:pPr>
             <w:r>
               <w:t xml:space="preserve"/>
             </w:r>
@@ -40,8 +49,13 @@
         <w:tc>
           <w:tcPr>
             <w:tcW w:w="4680" w:type="dxa"/>
-          </w:tcPr>
-          <w:p>
+            <w:shd w:val="clear" w:color="auto" w:fill="D9D9D9"/>
+            <w:vAlign w:val="center"/>
+          </w:tcPr>
+          <w:p>
+            <w:pPr>
+              <w:jc w:val="center"/>
+            </w:pPr>
             <w:r>
               <w:t xml:space="preserve"/>
             </w:r>
@@ -82,6 +96,9 @@
         </w:tc>
       </w:tr>
       <w:tr>
+        <w:trPr>
+          <w:trHeight w:val="576" w:hRule="atLeast"/>
+        </w:trPr>
         <w:tc>
           <w:tcPr>
             <w:tcW w:w="2340" w:type="dxa"/>
@@ -106,6 +123,9 @@
         <w:tc>
           <w:tcPr>
             <w:tcW w:w="4680" w:type="dxa"/>
+            <w:tcBorders>
+              <w:bottom w:val="double" w:sz="4" w:space="0" w:color="auto"/>
+            </w:tcBorders>
           </w:tcPr>
           <w:p>
             <w:r>
@@ -349,7 +369,7 @@
       <w:outlineLvl w:val="1"/>
     </w:pPr>
     <w:rPr>
-      <w:rFonts w:ascii="Calibri Light" w:hAnsi="Calibri Light"/>
+      <w:rFonts w:asciiTheme="majorHAnsi" w:hAnsiTheme="majorHAnsi" w:cstheme="majorBidi"/>
       <w:b/>
       <w:color w:val="2E74B5"/>
       <w:sz w:val="26"/>

</xml_diff>